<commit_message>
P42: 04 Borang 3 Skrip/Naratif + 02 Nota Kursus Canva min-5 syor
</commit_message>
<xml_diff>
--- a/04_Borang_Pertandingan_CDKK.docx
+++ b/04_Borang_Pertandingan_CDKK.docx
@@ -12302,31 +12302,7 @@
                 <w:szCs w:val="19"/>
                 <w:lang w:val="ms-MY"/>
               </w:rPr>
-              <w:t xml:space="preserve">Borang 3  ·  </w:t>
-            </w:r>
-            <w:proofErr w:type="spellStart"/>
-            <w:r>
-              <w:rPr>
-                <w:i/>
-                <w:iCs/>
-                <w:color w:val="FFFFFF"/>
-                <w:sz w:val="19"/>
-                <w:szCs w:val="19"/>
-                <w:lang w:val="ms-MY"/>
-              </w:rPr>
-              <w:t>Diisi</w:t>
-            </w:r>
-            <w:proofErr w:type="spellEnd"/>
-            <w:r>
-              <w:rPr>
-                <w:i/>
-                <w:iCs/>
-                <w:color w:val="FFFFFF"/>
-                <w:sz w:val="19"/>
-                <w:szCs w:val="19"/>
-                <w:lang w:val="ms-MY"/>
-              </w:rPr>
-              <w:t xml:space="preserve"> sebelum sebarang aset dibina</w:t>
+              <w:t xml:space="preserve">Borang 3  ·  Diisi sebelum sebarang aset dibina</w:t>
             </w:r>
           </w:p>
         </w:tc>
@@ -13021,13 +12997,6 @@
                 <w:lang w:val="ms-MY"/>
               </w:rPr>
               <w:t xml:space="preserve"> AI   </w:t>
-            </w:r>
-            <w:r>
-              <w:rPr>
-                <w:sz w:val="17"/>
-                <w:szCs w:val="17"/>
-                <w:lang w:val="ms-MY"/>
-              </w:rPr>
               <w:br/>
             </w:r>
             <w:r>
@@ -13206,13 +13175,6 @@
                 <w:lang w:val="ms-MY"/>
               </w:rPr>
               <w:t xml:space="preserve"> AI   </w:t>
-            </w:r>
-            <w:r>
-              <w:rPr>
-                <w:sz w:val="17"/>
-                <w:szCs w:val="17"/>
-                <w:lang w:val="ms-MY"/>
-              </w:rPr>
               <w:br/>
             </w:r>
             <w:r>
@@ -13494,7 +13456,7 @@
                 <w:szCs w:val="17"/>
                 <w:lang w:val="ms-MY"/>
               </w:rPr>
-              <w:t xml:space="preserve">Skrip : </w:t>
+              <w:t xml:space="preserve">Skrip / Naratif : </w:t>
             </w:r>
           </w:p>
         </w:tc>
@@ -13531,7 +13493,7 @@
                 <w:szCs w:val="17"/>
                 <w:lang w:val="ms-MY"/>
               </w:rPr>
-              <w:t>Skrip :</w:t>
+              <w:t>Skrip / Naratif :</w:t>
             </w:r>
           </w:p>
         </w:tc>
@@ -14081,13 +14043,6 @@
                 <w:lang w:val="ms-MY"/>
               </w:rPr>
               <w:t xml:space="preserve"> AI   </w:t>
-            </w:r>
-            <w:r>
-              <w:rPr>
-                <w:sz w:val="17"/>
-                <w:szCs w:val="17"/>
-                <w:lang w:val="ms-MY"/>
-              </w:rPr>
               <w:br/>
             </w:r>
             <w:r>
@@ -14266,13 +14221,6 @@
                 <w:lang w:val="ms-MY"/>
               </w:rPr>
               <w:t xml:space="preserve"> AI   </w:t>
-            </w:r>
-            <w:r>
-              <w:rPr>
-                <w:sz w:val="17"/>
-                <w:szCs w:val="17"/>
-                <w:lang w:val="ms-MY"/>
-              </w:rPr>
               <w:br/>
             </w:r>
             <w:r>
@@ -14554,7 +14502,7 @@
                 <w:szCs w:val="17"/>
                 <w:lang w:val="ms-MY"/>
               </w:rPr>
-              <w:t xml:space="preserve">Skrip : </w:t>
+              <w:t xml:space="preserve">Skrip / Naratif : </w:t>
             </w:r>
           </w:p>
         </w:tc>
@@ -14591,7 +14539,7 @@
                 <w:szCs w:val="17"/>
                 <w:lang w:val="ms-MY"/>
               </w:rPr>
-              <w:t>Skrip :</w:t>
+              <w:t>Skrip / Naratif :</w:t>
             </w:r>
           </w:p>
         </w:tc>
@@ -15487,13 +15435,6 @@
                 <w:lang w:val="ms-MY"/>
               </w:rPr>
               <w:t xml:space="preserve"> AI   </w:t>
-            </w:r>
-            <w:r>
-              <w:rPr>
-                <w:sz w:val="17"/>
-                <w:szCs w:val="17"/>
-                <w:lang w:val="ms-MY"/>
-              </w:rPr>
               <w:br/>
             </w:r>
             <w:r>
@@ -15672,13 +15613,6 @@
                 <w:lang w:val="ms-MY"/>
               </w:rPr>
               <w:t xml:space="preserve"> AI   </w:t>
-            </w:r>
-            <w:r>
-              <w:rPr>
-                <w:sz w:val="17"/>
-                <w:szCs w:val="17"/>
-                <w:lang w:val="ms-MY"/>
-              </w:rPr>
               <w:br/>
             </w:r>
             <w:r>
@@ -15960,7 +15894,7 @@
                 <w:szCs w:val="17"/>
                 <w:lang w:val="ms-MY"/>
               </w:rPr>
-              <w:t xml:space="preserve">Skrip : </w:t>
+              <w:t xml:space="preserve">Skrip / Naratif : </w:t>
             </w:r>
           </w:p>
         </w:tc>
@@ -15997,7 +15931,7 @@
                 <w:szCs w:val="17"/>
                 <w:lang w:val="ms-MY"/>
               </w:rPr>
-              <w:t>Skrip :</w:t>
+              <w:t>Skrip / Naratif :</w:t>
             </w:r>
           </w:p>
         </w:tc>
@@ -16547,13 +16481,6 @@
                 <w:lang w:val="ms-MY"/>
               </w:rPr>
               <w:t xml:space="preserve"> AI   </w:t>
-            </w:r>
-            <w:r>
-              <w:rPr>
-                <w:sz w:val="17"/>
-                <w:szCs w:val="17"/>
-                <w:lang w:val="ms-MY"/>
-              </w:rPr>
               <w:br/>
             </w:r>
             <w:r>
@@ -16732,13 +16659,6 @@
                 <w:lang w:val="ms-MY"/>
               </w:rPr>
               <w:t xml:space="preserve"> AI   </w:t>
-            </w:r>
-            <w:r>
-              <w:rPr>
-                <w:sz w:val="17"/>
-                <w:szCs w:val="17"/>
-                <w:lang w:val="ms-MY"/>
-              </w:rPr>
               <w:br/>
             </w:r>
             <w:r>
@@ -17020,7 +16940,7 @@
                 <w:szCs w:val="17"/>
                 <w:lang w:val="ms-MY"/>
               </w:rPr>
-              <w:t xml:space="preserve">Skrip : </w:t>
+              <w:t xml:space="preserve">Skrip / Naratif : </w:t>
             </w:r>
           </w:p>
         </w:tc>
@@ -17057,7 +16977,7 @@
                 <w:szCs w:val="17"/>
                 <w:lang w:val="ms-MY"/>
               </w:rPr>
-              <w:t>Skrip :</w:t>
+              <w:t>Skrip / Naratif :</w:t>
             </w:r>
           </w:p>
         </w:tc>
@@ -17258,31 +17178,7 @@
                 <w:szCs w:val="19"/>
                 <w:lang w:val="ms-MY"/>
               </w:rPr>
-              <w:t xml:space="preserve">Borang 3  ·  </w:t>
-            </w:r>
-            <w:proofErr w:type="spellStart"/>
-            <w:r>
-              <w:rPr>
-                <w:i/>
-                <w:iCs/>
-                <w:color w:val="FFFFFF"/>
-                <w:sz w:val="19"/>
-                <w:szCs w:val="19"/>
-                <w:lang w:val="ms-MY"/>
-              </w:rPr>
-              <w:t>Diisi</w:t>
-            </w:r>
-            <w:proofErr w:type="spellEnd"/>
-            <w:r>
-              <w:rPr>
-                <w:i/>
-                <w:iCs/>
-                <w:color w:val="FFFFFF"/>
-                <w:sz w:val="19"/>
-                <w:szCs w:val="19"/>
-                <w:lang w:val="ms-MY"/>
-              </w:rPr>
-              <w:t xml:space="preserve"> sebelum sebarang aset dibina</w:t>
+              <w:t xml:space="preserve">Borang 3  ·  Diisi sebelum sebarang aset dibina</w:t>
             </w:r>
           </w:p>
         </w:tc>
@@ -17977,13 +17873,6 @@
                 <w:lang w:val="ms-MY"/>
               </w:rPr>
               <w:t xml:space="preserve"> AI   </w:t>
-            </w:r>
-            <w:r>
-              <w:rPr>
-                <w:sz w:val="17"/>
-                <w:szCs w:val="17"/>
-                <w:lang w:val="ms-MY"/>
-              </w:rPr>
               <w:br/>
             </w:r>
             <w:r>
@@ -18162,13 +18051,6 @@
                 <w:lang w:val="ms-MY"/>
               </w:rPr>
               <w:t xml:space="preserve"> AI   </w:t>
-            </w:r>
-            <w:r>
-              <w:rPr>
-                <w:sz w:val="17"/>
-                <w:szCs w:val="17"/>
-                <w:lang w:val="ms-MY"/>
-              </w:rPr>
               <w:br/>
             </w:r>
             <w:r>
@@ -18450,7 +18332,7 @@
                 <w:szCs w:val="17"/>
                 <w:lang w:val="ms-MY"/>
               </w:rPr>
-              <w:t xml:space="preserve">Skrip : </w:t>
+              <w:t xml:space="preserve">Skrip / Naratif : </w:t>
             </w:r>
           </w:p>
         </w:tc>
@@ -18487,7 +18369,7 @@
                 <w:szCs w:val="17"/>
                 <w:lang w:val="ms-MY"/>
               </w:rPr>
-              <w:t>Skrip :</w:t>
+              <w:t>Skrip / Naratif :</w:t>
             </w:r>
           </w:p>
         </w:tc>
@@ -19037,13 +18919,6 @@
                 <w:lang w:val="ms-MY"/>
               </w:rPr>
               <w:t xml:space="preserve"> AI   </w:t>
-            </w:r>
-            <w:r>
-              <w:rPr>
-                <w:sz w:val="17"/>
-                <w:szCs w:val="17"/>
-                <w:lang w:val="ms-MY"/>
-              </w:rPr>
               <w:br/>
             </w:r>
             <w:r>
@@ -19222,13 +19097,6 @@
                 <w:lang w:val="ms-MY"/>
               </w:rPr>
               <w:t xml:space="preserve"> AI   </w:t>
-            </w:r>
-            <w:r>
-              <w:rPr>
-                <w:sz w:val="17"/>
-                <w:szCs w:val="17"/>
-                <w:lang w:val="ms-MY"/>
-              </w:rPr>
               <w:br/>
             </w:r>
             <w:r>
@@ -19510,7 +19378,7 @@
                 <w:szCs w:val="17"/>
                 <w:lang w:val="ms-MY"/>
               </w:rPr>
-              <w:t xml:space="preserve">Skrip : </w:t>
+              <w:t xml:space="preserve">Skrip / Naratif : </w:t>
             </w:r>
           </w:p>
         </w:tc>
@@ -19547,7 +19415,7 @@
                 <w:szCs w:val="17"/>
                 <w:lang w:val="ms-MY"/>
               </w:rPr>
-              <w:t>Skrip :</w:t>
+              <w:t>Skrip / Naratif :</w:t>
             </w:r>
           </w:p>
         </w:tc>
@@ -21475,14 +21343,6 @@
                 <w:lang w:val="ms-MY"/>
               </w:rPr>
               <w:t xml:space="preserve">Unjuran Jualan </w:t>
-            </w:r>
-            <w:r>
-              <w:rPr>
-                <w:b/>
-                <w:bCs/>
-                <w:color w:val="FFFFFF"/>
-                <w:lang w:val="ms-MY"/>
-              </w:rPr>
               <w:br/>
               <w:t>(RM)</w:t>
             </w:r>
@@ -29279,30 +29139,8 @@
               <w:rPr>
                 <w:lang w:val="ms-MY"/>
               </w:rPr>
-              <w:t xml:space="preserve">Tandatangan </w:t>
-            </w:r>
-            <w:proofErr w:type="spellStart"/>
-            <w:r>
-              <w:rPr>
-                <w:lang w:val="ms-MY"/>
-              </w:rPr>
-              <w:t>Pempamer</w:t>
-            </w:r>
-            <w:proofErr w:type="spellEnd"/>
-            <w:r>
-              <w:rPr>
-                <w:lang w:val="ms-MY"/>
-              </w:rPr>
-              <w:t xml:space="preserve"> Atau </w:t>
-            </w:r>
-            <w:proofErr w:type="spellStart"/>
-            <w:r>
-              <w:rPr>
-                <w:lang w:val="ms-MY"/>
-              </w:rPr>
-              <w:t>Pendemo</w:t>
-            </w:r>
-            <w:proofErr w:type="spellEnd"/>
+              <w:t xml:space="preserve">Tandatangan Pempamer Atau Pendemo</w:t>
+            </w:r>
           </w:p>
         </w:tc>
       </w:tr>
@@ -31547,13 +31385,6 @@
                 <w:lang w:val="ms-MY"/>
               </w:rPr>
               <w:t xml:space="preserve">JUMLAH MARKAH HAKIM </w:t>
-            </w:r>
-            <w:r>
-              <w:rPr>
-                <w:b/>
-                <w:bCs/>
-                <w:lang w:val="ms-MY"/>
-              </w:rPr>
               <w:br/>
               <w:t>(daripada 100)</w:t>
             </w:r>
@@ -36679,13 +36510,7 @@
               <w:rPr>
                 <w:lang w:val="ms-MY"/>
               </w:rPr>
-              <w:t xml:space="preserve"> Ya</w:t>
-            </w:r>
-            <w:r>
-              <w:rPr>
-                <w:lang w:val="ms-MY"/>
-              </w:rPr>
-              <w:t xml:space="preserve">                      </w:t>
+              <w:t xml:space="preserve"> Ya                      </w:t>
             </w:r>
             <w:sdt>
               <w:sdtPr>
@@ -36756,11 +36581,6 @@
                 <w:lang w:val="ms-MY"/>
               </w:rPr>
               <w:t xml:space="preserve">Templat Digunakan </w:t>
-            </w:r>
-            <w:r>
-              <w:rPr>
-                <w:lang w:val="ms-MY"/>
-              </w:rPr>
               <w:br/>
               <w:t>(Jika Ada)</w:t>
             </w:r>
@@ -38613,13 +38433,6 @@
                 <w:lang w:val="ms-MY"/>
               </w:rPr>
               <w:t xml:space="preserve">Diterima Oleh </w:t>
-            </w:r>
-            <w:r>
-              <w:rPr>
-                <w:b/>
-                <w:bCs/>
-                <w:lang w:val="ms-MY"/>
-              </w:rPr>
               <w:br/>
               <w:t>(Urus Setia Negeri)</w:t>
             </w:r>
@@ -45192,7 +45005,7 @@
                 <w:color w:val="1F2937"/>
                 <w:lang w:val="ms-MY"/>
               </w:rPr>
-              <w:t>Skrip dan storyboard siap</w:t>
+              <w:t xml:space="preserve">Skrip/naratif dan storyboard siap</w:t>
             </w:r>
           </w:p>
         </w:tc>

</xml_diff>